<commit_message>
Relax Release Phase rule for single-version suggestions
- 建议单：发现BUG版本单选时不再固定期望 DEV，放宽为「非 Product Release」，
  结果表加标红提示由人工判断具体取值（多选仍要求 Product Release）
- ⚠️ 提示行不参与通过判定
- 实时结果表与静态报告两处渲染均支持 ⚠️ 标红
- 同步 docs/BUG校验规则.md 与 HTML前端实现文档
- 打包脚本移除不存在的 使用方法.md 条目
- 纳入 data/规格.json、spec-tree.default.json 及规格树生成/校验脚本
</commit_message>
<xml_diff>
--- a/使用方法.docx
+++ b/使用方法.docx
@@ -646,6 +646,13 @@
       </w:r>
     </w:p>
     <w:p>
+      <w:pPr>
+        <w:rPr>
+          <w:rFonts w:ascii="微软雅黑" w:hAnsi="微软雅黑" w:eastAsia="微软雅黑"/>
+          <w:b w:val="0"/>
+          <w:sz w:val="22"/>
+        </w:rPr>
+      </w:pPr>
       <w:r>
         <w:rPr>
           <w:rFonts w:ascii="微软雅黑" w:hAnsi="微软雅黑" w:eastAsia="微软雅黑"/>
@@ -680,6 +687,52 @@
         </w:rPr>
         <w:t>。</w:t>
       </w:r>
+    </w:p>
+    <w:p>
+      <w:pPr>
+        <w:pStyle w:val="4"/>
+        <w:rPr>
+          <w:rFonts w:hint="eastAsia" w:eastAsia="宋体"/>
+          <w:lang w:val="en-US" w:eastAsia="zh-CN"/>
+        </w:rPr>
+      </w:pPr>
+      <w:r>
+        <w:rPr>
+          <w:rFonts w:hint="eastAsia" w:eastAsia="宋体"/>
+          <w:lang w:val="en-US" w:eastAsia="zh-CN"/>
+        </w:rPr>
+        <w:t>5</w:t>
+      </w:r>
+      <w:r>
+        <w:t xml:space="preserve">. </w:t>
+      </w:r>
+      <w:r>
+        <w:rPr>
+          <w:rFonts w:hint="eastAsia" w:eastAsia="宋体"/>
+          <w:lang w:val="en-US" w:eastAsia="zh-CN"/>
+        </w:rPr>
+        <w:t>规格</w:t>
+      </w:r>
+    </w:p>
+    <w:p>
+      <w:pPr>
+        <w:rPr>
+          <w:rFonts w:ascii="微软雅黑" w:hAnsi="微软雅黑" w:eastAsia="微软雅黑"/>
+          <w:b w:val="0"/>
+          <w:sz w:val="22"/>
+        </w:rPr>
+      </w:pPr>
+      <w:r>
+        <w:rPr>
+          <w:rFonts w:hint="eastAsia" w:ascii="微软雅黑" w:hAnsi="微软雅黑" w:eastAsia="微软雅黑"/>
+          <w:b w:val="0"/>
+          <w:sz w:val="22"/>
+          <w:lang w:val="en-US" w:eastAsia="zh-CN"/>
+        </w:rPr>
+        <w:t>如有新增模块，在data/规格.json内新增。</w:t>
+      </w:r>
+      <w:bookmarkStart w:id="0" w:name="_GoBack"/>
+      <w:bookmarkEnd w:id="0"/>
     </w:p>
     <w:p>
       <w:pPr>
@@ -1138,12 +1191,6 @@
             <w:insideH w:val="single" w:color="auto" w:sz="4" w:space="0"/>
             <w:insideV w:val="single" w:color="auto" w:sz="4" w:space="0"/>
           </w:tblBorders>
-          <w:tblCellMar>
-            <w:top w:w="0" w:type="dxa"/>
-            <w:left w:w="108" w:type="dxa"/>
-            <w:bottom w:w="0" w:type="dxa"/>
-            <w:right w:w="108" w:type="dxa"/>
-          </w:tblCellMar>
         </w:tblPrEx>
         <w:trPr>
           <w:jc w:val="center"/>
@@ -1480,8 +1527,6 @@
         </w:rPr>
         <w:t>看 docs\BUG校验规则.md；改规则后需同步改 src\validate-server.js。</w:t>
       </w:r>
-      <w:bookmarkStart w:id="0" w:name="_GoBack"/>
-      <w:bookmarkEnd w:id="0"/>
     </w:p>
     <w:p>
       <w:r>
@@ -1744,7 +1789,7 @@
     <w:lsdException w:uiPriority="99" w:name="footnote text"/>
     <w:lsdException w:uiPriority="99" w:name="annotation text"/>
     <w:lsdException w:uiPriority="99" w:semiHidden="0" w:name="header"/>
-    <w:lsdException w:uiPriority="99" w:semiHidden="0" w:name="footer"/>
+    <w:lsdException w:qFormat="1" w:uiPriority="99" w:semiHidden="0" w:name="footer"/>
     <w:lsdException w:uiPriority="99" w:name="index heading"/>
     <w:lsdException w:qFormat="1" w:uiPriority="35" w:name="caption"/>
     <w:lsdException w:uiPriority="99" w:name="table of figures"/>
@@ -1759,30 +1804,30 @@
     <w:lsdException w:uiPriority="99" w:name="table of authorities"/>
     <w:lsdException w:qFormat="1" w:uiPriority="99" w:semiHidden="0" w:name="macro"/>
     <w:lsdException w:uiPriority="99" w:name="toa heading"/>
-    <w:lsdException w:uiPriority="99" w:semiHidden="0" w:name="List"/>
+    <w:lsdException w:qFormat="1" w:uiPriority="99" w:semiHidden="0" w:name="List"/>
     <w:lsdException w:qFormat="1" w:uiPriority="99" w:semiHidden="0" w:name="List Bullet"/>
-    <w:lsdException w:uiPriority="99" w:semiHidden="0" w:name="List Number"/>
-    <w:lsdException w:uiPriority="99" w:semiHidden="0" w:name="List 2"/>
+    <w:lsdException w:qFormat="1" w:uiPriority="99" w:semiHidden="0" w:name="List Number"/>
+    <w:lsdException w:qFormat="1" w:uiPriority="99" w:semiHidden="0" w:name="List 2"/>
     <w:lsdException w:qFormat="1" w:uiPriority="99" w:semiHidden="0" w:name="List 3"/>
     <w:lsdException w:uiPriority="99" w:name="List 4"/>
     <w:lsdException w:uiPriority="99" w:name="List 5"/>
-    <w:lsdException w:uiPriority="99" w:semiHidden="0" w:name="List Bullet 2"/>
-    <w:lsdException w:uiPriority="99" w:semiHidden="0" w:name="List Bullet 3"/>
+    <w:lsdException w:qFormat="1" w:uiPriority="99" w:semiHidden="0" w:name="List Bullet 2"/>
+    <w:lsdException w:qFormat="1" w:uiPriority="99" w:semiHidden="0" w:name="List Bullet 3"/>
     <w:lsdException w:uiPriority="99" w:name="List Bullet 4"/>
     <w:lsdException w:uiPriority="99" w:name="List Bullet 5"/>
     <w:lsdException w:uiPriority="99" w:semiHidden="0" w:name="List Number 2"/>
-    <w:lsdException w:uiPriority="99" w:semiHidden="0" w:name="List Number 3"/>
+    <w:lsdException w:qFormat="1" w:uiPriority="99" w:semiHidden="0" w:name="List Number 3"/>
     <w:lsdException w:uiPriority="99" w:name="List Number 4"/>
     <w:lsdException w:uiPriority="99" w:name="List Number 5"/>
     <w:lsdException w:qFormat="1" w:unhideWhenUsed="0" w:uiPriority="10" w:semiHidden="0" w:name="Title"/>
     <w:lsdException w:uiPriority="99" w:name="Closing"/>
     <w:lsdException w:uiPriority="99" w:name="Signature"/>
     <w:lsdException w:qFormat="1" w:uiPriority="1" w:name="Default Paragraph Font"/>
-    <w:lsdException w:uiPriority="99" w:semiHidden="0" w:name="Body Text"/>
+    <w:lsdException w:qFormat="1" w:uiPriority="99" w:semiHidden="0" w:name="Body Text"/>
     <w:lsdException w:uiPriority="99" w:name="Body Text Indent"/>
-    <w:lsdException w:uiPriority="99" w:semiHidden="0" w:name="List Continue"/>
-    <w:lsdException w:uiPriority="99" w:semiHidden="0" w:name="List Continue 2"/>
-    <w:lsdException w:uiPriority="99" w:semiHidden="0" w:name="List Continue 3"/>
+    <w:lsdException w:qFormat="1" w:uiPriority="99" w:semiHidden="0" w:name="List Continue"/>
+    <w:lsdException w:qFormat="1" w:uiPriority="99" w:semiHidden="0" w:name="List Continue 2"/>
+    <w:lsdException w:qFormat="1" w:uiPriority="99" w:semiHidden="0" w:name="List Continue 3"/>
     <w:lsdException w:uiPriority="99" w:name="List Continue 4"/>
     <w:lsdException w:uiPriority="99" w:name="List Continue 5"/>
     <w:lsdException w:uiPriority="99" w:name="Message Header"/>
@@ -1792,7 +1837,7 @@
     <w:lsdException w:uiPriority="99" w:name="Body Text First Indent"/>
     <w:lsdException w:uiPriority="99" w:name="Body Text First Indent 2"/>
     <w:lsdException w:uiPriority="99" w:name="Note Heading"/>
-    <w:lsdException w:uiPriority="99" w:semiHidden="0" w:name="Body Text 2"/>
+    <w:lsdException w:qFormat="1" w:uiPriority="99" w:semiHidden="0" w:name="Body Text 2"/>
     <w:lsdException w:qFormat="1" w:uiPriority="99" w:semiHidden="0" w:name="Body Text 3"/>
     <w:lsdException w:uiPriority="99" w:name="Body Text Indent 2"/>
     <w:lsdException w:uiPriority="99" w:name="Body Text Indent 3"/>
@@ -1860,110 +1905,110 @@
     <w:lsdException w:uiPriority="99" w:name="Table Web 2"/>
     <w:lsdException w:uiPriority="99" w:name="Table Web 3"/>
     <w:lsdException w:uiPriority="99" w:name="Balloon Text"/>
-    <w:lsdException w:unhideWhenUsed="0" w:uiPriority="59" w:semiHidden="0" w:name="Table Grid"/>
+    <w:lsdException w:qFormat="1" w:unhideWhenUsed="0" w:uiPriority="59" w:semiHidden="0" w:name="Table Grid"/>
     <w:lsdException w:uiPriority="99" w:name="Table Theme"/>
     <w:lsdException w:qFormat="1" w:unhideWhenUsed="0" w:uiPriority="1" w:semiHidden="0" w:name="No Spacing"/>
-    <w:lsdException w:unhideWhenUsed="0" w:uiPriority="60" w:semiHidden="0" w:name="Light Shading"/>
-    <w:lsdException w:unhideWhenUsed="0" w:uiPriority="61" w:semiHidden="0" w:name="Light List"/>
-    <w:lsdException w:unhideWhenUsed="0" w:uiPriority="62" w:semiHidden="0" w:name="Light Grid"/>
-    <w:lsdException w:unhideWhenUsed="0" w:uiPriority="63" w:semiHidden="0" w:name="Medium Shading 1"/>
-    <w:lsdException w:unhideWhenUsed="0" w:uiPriority="64" w:semiHidden="0" w:name="Medium Shading 2"/>
+    <w:lsdException w:qFormat="1" w:unhideWhenUsed="0" w:uiPriority="60" w:semiHidden="0" w:name="Light Shading"/>
+    <w:lsdException w:qFormat="1" w:unhideWhenUsed="0" w:uiPriority="61" w:semiHidden="0" w:name="Light List"/>
+    <w:lsdException w:qFormat="1" w:unhideWhenUsed="0" w:uiPriority="62" w:semiHidden="0" w:name="Light Grid"/>
+    <w:lsdException w:qFormat="1" w:unhideWhenUsed="0" w:uiPriority="63" w:semiHidden="0" w:name="Medium Shading 1"/>
+    <w:lsdException w:qFormat="1" w:unhideWhenUsed="0" w:uiPriority="64" w:semiHidden="0" w:name="Medium Shading 2"/>
     <w:lsdException w:unhideWhenUsed="0" w:uiPriority="65" w:semiHidden="0" w:name="Medium List 1"/>
-    <w:lsdException w:unhideWhenUsed="0" w:uiPriority="66" w:semiHidden="0" w:name="Medium List 2"/>
-    <w:lsdException w:unhideWhenUsed="0" w:uiPriority="67" w:semiHidden="0" w:name="Medium Grid 1"/>
-    <w:lsdException w:unhideWhenUsed="0" w:uiPriority="68" w:semiHidden="0" w:name="Medium Grid 2"/>
-    <w:lsdException w:unhideWhenUsed="0" w:uiPriority="69" w:semiHidden="0" w:name="Medium Grid 3"/>
-    <w:lsdException w:unhideWhenUsed="0" w:uiPriority="70" w:semiHidden="0" w:name="Dark List"/>
+    <w:lsdException w:qFormat="1" w:unhideWhenUsed="0" w:uiPriority="66" w:semiHidden="0" w:name="Medium List 2"/>
+    <w:lsdException w:qFormat="1" w:unhideWhenUsed="0" w:uiPriority="67" w:semiHidden="0" w:name="Medium Grid 1"/>
+    <w:lsdException w:qFormat="1" w:unhideWhenUsed="0" w:uiPriority="68" w:semiHidden="0" w:name="Medium Grid 2"/>
+    <w:lsdException w:qFormat="1" w:unhideWhenUsed="0" w:uiPriority="69" w:semiHidden="0" w:name="Medium Grid 3"/>
+    <w:lsdException w:qFormat="1" w:unhideWhenUsed="0" w:uiPriority="70" w:semiHidden="0" w:name="Dark List"/>
     <w:lsdException w:unhideWhenUsed="0" w:uiPriority="71" w:semiHidden="0" w:name="Colorful Shading"/>
-    <w:lsdException w:unhideWhenUsed="0" w:uiPriority="72" w:semiHidden="0" w:name="Colorful List"/>
-    <w:lsdException w:unhideWhenUsed="0" w:uiPriority="73" w:semiHidden="0" w:name="Colorful Grid"/>
-    <w:lsdException w:unhideWhenUsed="0" w:uiPriority="60" w:semiHidden="0" w:name="Light Shading Accent 1"/>
-    <w:lsdException w:unhideWhenUsed="0" w:uiPriority="61" w:semiHidden="0" w:name="Light List Accent 1"/>
-    <w:lsdException w:unhideWhenUsed="0" w:uiPriority="62" w:semiHidden="0" w:name="Light Grid Accent 1"/>
+    <w:lsdException w:qFormat="1" w:unhideWhenUsed="0" w:uiPriority="72" w:semiHidden="0" w:name="Colorful List"/>
+    <w:lsdException w:qFormat="1" w:unhideWhenUsed="0" w:uiPriority="73" w:semiHidden="0" w:name="Colorful Grid"/>
+    <w:lsdException w:qFormat="1" w:unhideWhenUsed="0" w:uiPriority="60" w:semiHidden="0" w:name="Light Shading Accent 1"/>
+    <w:lsdException w:qFormat="1" w:unhideWhenUsed="0" w:uiPriority="61" w:semiHidden="0" w:name="Light List Accent 1"/>
+    <w:lsdException w:qFormat="1" w:unhideWhenUsed="0" w:uiPriority="62" w:semiHidden="0" w:name="Light Grid Accent 1"/>
     <w:lsdException w:qFormat="1" w:unhideWhenUsed="0" w:uiPriority="63" w:semiHidden="0" w:name="Medium Shading 1 Accent 1"/>
-    <w:lsdException w:unhideWhenUsed="0" w:uiPriority="64" w:semiHidden="0" w:name="Medium Shading 2 Accent 1"/>
-    <w:lsdException w:unhideWhenUsed="0" w:uiPriority="65" w:semiHidden="0" w:name="Medium List 1 Accent 1"/>
+    <w:lsdException w:qFormat="1" w:unhideWhenUsed="0" w:uiPriority="64" w:semiHidden="0" w:name="Medium Shading 2 Accent 1"/>
+    <w:lsdException w:qFormat="1" w:unhideWhenUsed="0" w:uiPriority="65" w:semiHidden="0" w:name="Medium List 1 Accent 1"/>
     <w:lsdException w:qFormat="1" w:unhideWhenUsed="0" w:uiPriority="34" w:semiHidden="0" w:name="List Paragraph"/>
     <w:lsdException w:qFormat="1" w:unhideWhenUsed="0" w:uiPriority="29" w:semiHidden="0" w:name="Quote"/>
     <w:lsdException w:qFormat="1" w:unhideWhenUsed="0" w:uiPriority="30" w:semiHidden="0" w:name="Intense Quote"/>
-    <w:lsdException w:unhideWhenUsed="0" w:uiPriority="66" w:semiHidden="0" w:name="Medium List 2 Accent 1"/>
-    <w:lsdException w:unhideWhenUsed="0" w:uiPriority="67" w:semiHidden="0" w:name="Medium Grid 1 Accent 1"/>
-    <w:lsdException w:unhideWhenUsed="0" w:uiPriority="68" w:semiHidden="0" w:name="Medium Grid 2 Accent 1"/>
+    <w:lsdException w:qFormat="1" w:unhideWhenUsed="0" w:uiPriority="66" w:semiHidden="0" w:name="Medium List 2 Accent 1"/>
+    <w:lsdException w:qFormat="1" w:unhideWhenUsed="0" w:uiPriority="67" w:semiHidden="0" w:name="Medium Grid 1 Accent 1"/>
+    <w:lsdException w:qFormat="1" w:unhideWhenUsed="0" w:uiPriority="68" w:semiHidden="0" w:name="Medium Grid 2 Accent 1"/>
     <w:lsdException w:unhideWhenUsed="0" w:uiPriority="69" w:semiHidden="0" w:name="Medium Grid 3 Accent 1"/>
-    <w:lsdException w:unhideWhenUsed="0" w:uiPriority="70" w:semiHidden="0" w:name="Dark List Accent 1"/>
-    <w:lsdException w:unhideWhenUsed="0" w:uiPriority="71" w:semiHidden="0" w:name="Colorful Shading Accent 1"/>
-    <w:lsdException w:unhideWhenUsed="0" w:uiPriority="72" w:semiHidden="0" w:name="Colorful List Accent 1"/>
-    <w:lsdException w:unhideWhenUsed="0" w:uiPriority="73" w:semiHidden="0" w:name="Colorful Grid Accent 1"/>
-    <w:lsdException w:unhideWhenUsed="0" w:uiPriority="60" w:semiHidden="0" w:name="Light Shading Accent 2"/>
-    <w:lsdException w:unhideWhenUsed="0" w:uiPriority="61" w:semiHidden="0" w:name="Light List Accent 2"/>
+    <w:lsdException w:qFormat="1" w:unhideWhenUsed="0" w:uiPriority="70" w:semiHidden="0" w:name="Dark List Accent 1"/>
+    <w:lsdException w:qFormat="1" w:unhideWhenUsed="0" w:uiPriority="71" w:semiHidden="0" w:name="Colorful Shading Accent 1"/>
+    <w:lsdException w:qFormat="1" w:unhideWhenUsed="0" w:uiPriority="72" w:semiHidden="0" w:name="Colorful List Accent 1"/>
+    <w:lsdException w:qFormat="1" w:unhideWhenUsed="0" w:uiPriority="73" w:semiHidden="0" w:name="Colorful Grid Accent 1"/>
+    <w:lsdException w:qFormat="1" w:unhideWhenUsed="0" w:uiPriority="60" w:semiHidden="0" w:name="Light Shading Accent 2"/>
+    <w:lsdException w:qFormat="1" w:unhideWhenUsed="0" w:uiPriority="61" w:semiHidden="0" w:name="Light List Accent 2"/>
     <w:lsdException w:unhideWhenUsed="0" w:uiPriority="62" w:semiHidden="0" w:name="Light Grid Accent 2"/>
-    <w:lsdException w:unhideWhenUsed="0" w:uiPriority="63" w:semiHidden="0" w:name="Medium Shading 1 Accent 2"/>
-    <w:lsdException w:unhideWhenUsed="0" w:uiPriority="64" w:semiHidden="0" w:name="Medium Shading 2 Accent 2"/>
-    <w:lsdException w:unhideWhenUsed="0" w:uiPriority="65" w:semiHidden="0" w:name="Medium List 1 Accent 2"/>
-    <w:lsdException w:unhideWhenUsed="0" w:uiPriority="66" w:semiHidden="0" w:name="Medium List 2 Accent 2"/>
-    <w:lsdException w:unhideWhenUsed="0" w:uiPriority="67" w:semiHidden="0" w:name="Medium Grid 1 Accent 2"/>
-    <w:lsdException w:unhideWhenUsed="0" w:uiPriority="68" w:semiHidden="0" w:name="Medium Grid 2 Accent 2"/>
-    <w:lsdException w:unhideWhenUsed="0" w:uiPriority="69" w:semiHidden="0" w:name="Medium Grid 3 Accent 2"/>
+    <w:lsdException w:qFormat="1" w:unhideWhenUsed="0" w:uiPriority="63" w:semiHidden="0" w:name="Medium Shading 1 Accent 2"/>
+    <w:lsdException w:qFormat="1" w:unhideWhenUsed="0" w:uiPriority="64" w:semiHidden="0" w:name="Medium Shading 2 Accent 2"/>
+    <w:lsdException w:qFormat="1" w:unhideWhenUsed="0" w:uiPriority="65" w:semiHidden="0" w:name="Medium List 1 Accent 2"/>
+    <w:lsdException w:qFormat="1" w:unhideWhenUsed="0" w:uiPriority="66" w:semiHidden="0" w:name="Medium List 2 Accent 2"/>
+    <w:lsdException w:qFormat="1" w:unhideWhenUsed="0" w:uiPriority="67" w:semiHidden="0" w:name="Medium Grid 1 Accent 2"/>
+    <w:lsdException w:qFormat="1" w:unhideWhenUsed="0" w:uiPriority="68" w:semiHidden="0" w:name="Medium Grid 2 Accent 2"/>
+    <w:lsdException w:qFormat="1" w:unhideWhenUsed="0" w:uiPriority="69" w:semiHidden="0" w:name="Medium Grid 3 Accent 2"/>
     <w:lsdException w:unhideWhenUsed="0" w:uiPriority="70" w:semiHidden="0" w:name="Dark List Accent 2"/>
-    <w:lsdException w:unhideWhenUsed="0" w:uiPriority="71" w:semiHidden="0" w:name="Colorful Shading Accent 2"/>
-    <w:lsdException w:unhideWhenUsed="0" w:uiPriority="72" w:semiHidden="0" w:name="Colorful List Accent 2"/>
-    <w:lsdException w:unhideWhenUsed="0" w:uiPriority="73" w:semiHidden="0" w:name="Colorful Grid Accent 2"/>
+    <w:lsdException w:qFormat="1" w:unhideWhenUsed="0" w:uiPriority="71" w:semiHidden="0" w:name="Colorful Shading Accent 2"/>
+    <w:lsdException w:qFormat="1" w:unhideWhenUsed="0" w:uiPriority="72" w:semiHidden="0" w:name="Colorful List Accent 2"/>
+    <w:lsdException w:qFormat="1" w:unhideWhenUsed="0" w:uiPriority="73" w:semiHidden="0" w:name="Colorful Grid Accent 2"/>
     <w:lsdException w:unhideWhenUsed="0" w:uiPriority="60" w:semiHidden="0" w:name="Light Shading Accent 3"/>
-    <w:lsdException w:unhideWhenUsed="0" w:uiPriority="61" w:semiHidden="0" w:name="Light List Accent 3"/>
-    <w:lsdException w:unhideWhenUsed="0" w:uiPriority="62" w:semiHidden="0" w:name="Light Grid Accent 3"/>
+    <w:lsdException w:qFormat="1" w:unhideWhenUsed="0" w:uiPriority="61" w:semiHidden="0" w:name="Light List Accent 3"/>
+    <w:lsdException w:qFormat="1" w:unhideWhenUsed="0" w:uiPriority="62" w:semiHidden="0" w:name="Light Grid Accent 3"/>
     <w:lsdException w:qFormat="1" w:unhideWhenUsed="0" w:uiPriority="63" w:semiHidden="0" w:name="Medium Shading 1 Accent 3"/>
-    <w:lsdException w:unhideWhenUsed="0" w:uiPriority="64" w:semiHidden="0" w:name="Medium Shading 2 Accent 3"/>
-    <w:lsdException w:unhideWhenUsed="0" w:uiPriority="65" w:semiHidden="0" w:name="Medium List 1 Accent 3"/>
-    <w:lsdException w:unhideWhenUsed="0" w:uiPriority="66" w:semiHidden="0" w:name="Medium List 2 Accent 3"/>
-    <w:lsdException w:unhideWhenUsed="0" w:uiPriority="67" w:semiHidden="0" w:name="Medium Grid 1 Accent 3"/>
-    <w:lsdException w:unhideWhenUsed="0" w:uiPriority="68" w:semiHidden="0" w:name="Medium Grid 2 Accent 3"/>
-    <w:lsdException w:unhideWhenUsed="0" w:uiPriority="69" w:semiHidden="0" w:name="Medium Grid 3 Accent 3"/>
-    <w:lsdException w:unhideWhenUsed="0" w:uiPriority="70" w:semiHidden="0" w:name="Dark List Accent 3"/>
-    <w:lsdException w:unhideWhenUsed="0" w:uiPriority="71" w:semiHidden="0" w:name="Colorful Shading Accent 3"/>
-    <w:lsdException w:unhideWhenUsed="0" w:uiPriority="72" w:semiHidden="0" w:name="Colorful List Accent 3"/>
-    <w:lsdException w:unhideWhenUsed="0" w:uiPriority="73" w:semiHidden="0" w:name="Colorful Grid Accent 3"/>
-    <w:lsdException w:unhideWhenUsed="0" w:uiPriority="60" w:semiHidden="0" w:name="Light Shading Accent 4"/>
-    <w:lsdException w:unhideWhenUsed="0" w:uiPriority="61" w:semiHidden="0" w:name="Light List Accent 4"/>
-    <w:lsdException w:unhideWhenUsed="0" w:uiPriority="62" w:semiHidden="0" w:name="Light Grid Accent 4"/>
-    <w:lsdException w:unhideWhenUsed="0" w:uiPriority="63" w:semiHidden="0" w:name="Medium Shading 1 Accent 4"/>
-    <w:lsdException w:unhideWhenUsed="0" w:uiPriority="64" w:semiHidden="0" w:name="Medium Shading 2 Accent 4"/>
-    <w:lsdException w:unhideWhenUsed="0" w:uiPriority="65" w:semiHidden="0" w:name="Medium List 1 Accent 4"/>
-    <w:lsdException w:unhideWhenUsed="0" w:uiPriority="66" w:semiHidden="0" w:name="Medium List 2 Accent 4"/>
+    <w:lsdException w:qFormat="1" w:unhideWhenUsed="0" w:uiPriority="64" w:semiHidden="0" w:name="Medium Shading 2 Accent 3"/>
+    <w:lsdException w:qFormat="1" w:unhideWhenUsed="0" w:uiPriority="65" w:semiHidden="0" w:name="Medium List 1 Accent 3"/>
+    <w:lsdException w:qFormat="1" w:unhideWhenUsed="0" w:uiPriority="66" w:semiHidden="0" w:name="Medium List 2 Accent 3"/>
+    <w:lsdException w:qFormat="1" w:unhideWhenUsed="0" w:uiPriority="67" w:semiHidden="0" w:name="Medium Grid 1 Accent 3"/>
+    <w:lsdException w:qFormat="1" w:unhideWhenUsed="0" w:uiPriority="68" w:semiHidden="0" w:name="Medium Grid 2 Accent 3"/>
+    <w:lsdException w:qFormat="1" w:unhideWhenUsed="0" w:uiPriority="69" w:semiHidden="0" w:name="Medium Grid 3 Accent 3"/>
+    <w:lsdException w:qFormat="1" w:unhideWhenUsed="0" w:uiPriority="70" w:semiHidden="0" w:name="Dark List Accent 3"/>
+    <w:lsdException w:qFormat="1" w:unhideWhenUsed="0" w:uiPriority="71" w:semiHidden="0" w:name="Colorful Shading Accent 3"/>
+    <w:lsdException w:qFormat="1" w:unhideWhenUsed="0" w:uiPriority="72" w:semiHidden="0" w:name="Colorful List Accent 3"/>
+    <w:lsdException w:qFormat="1" w:unhideWhenUsed="0" w:uiPriority="73" w:semiHidden="0" w:name="Colorful Grid Accent 3"/>
+    <w:lsdException w:qFormat="1" w:unhideWhenUsed="0" w:uiPriority="60" w:semiHidden="0" w:name="Light Shading Accent 4"/>
+    <w:lsdException w:qFormat="1" w:unhideWhenUsed="0" w:uiPriority="61" w:semiHidden="0" w:name="Light List Accent 4"/>
+    <w:lsdException w:qFormat="1" w:unhideWhenUsed="0" w:uiPriority="62" w:semiHidden="0" w:name="Light Grid Accent 4"/>
+    <w:lsdException w:qFormat="1" w:unhideWhenUsed="0" w:uiPriority="63" w:semiHidden="0" w:name="Medium Shading 1 Accent 4"/>
+    <w:lsdException w:qFormat="1" w:unhideWhenUsed="0" w:uiPriority="64" w:semiHidden="0" w:name="Medium Shading 2 Accent 4"/>
+    <w:lsdException w:qFormat="1" w:unhideWhenUsed="0" w:uiPriority="65" w:semiHidden="0" w:name="Medium List 1 Accent 4"/>
+    <w:lsdException w:qFormat="1" w:unhideWhenUsed="0" w:uiPriority="66" w:semiHidden="0" w:name="Medium List 2 Accent 4"/>
     <w:lsdException w:unhideWhenUsed="0" w:uiPriority="67" w:semiHidden="0" w:name="Medium Grid 1 Accent 4"/>
-    <w:lsdException w:unhideWhenUsed="0" w:uiPriority="68" w:semiHidden="0" w:name="Medium Grid 2 Accent 4"/>
-    <w:lsdException w:unhideWhenUsed="0" w:uiPriority="69" w:semiHidden="0" w:name="Medium Grid 3 Accent 4"/>
-    <w:lsdException w:unhideWhenUsed="0" w:uiPriority="70" w:semiHidden="0" w:name="Dark List Accent 4"/>
-    <w:lsdException w:unhideWhenUsed="0" w:uiPriority="71" w:semiHidden="0" w:name="Colorful Shading Accent 4"/>
-    <w:lsdException w:unhideWhenUsed="0" w:uiPriority="72" w:semiHidden="0" w:name="Colorful List Accent 4"/>
-    <w:lsdException w:unhideWhenUsed="0" w:uiPriority="73" w:semiHidden="0" w:name="Colorful Grid Accent 4"/>
-    <w:lsdException w:unhideWhenUsed="0" w:uiPriority="60" w:semiHidden="0" w:name="Light Shading Accent 5"/>
-    <w:lsdException w:unhideWhenUsed="0" w:uiPriority="61" w:semiHidden="0" w:name="Light List Accent 5"/>
-    <w:lsdException w:unhideWhenUsed="0" w:uiPriority="62" w:semiHidden="0" w:name="Light Grid Accent 5"/>
+    <w:lsdException w:qFormat="1" w:unhideWhenUsed="0" w:uiPriority="68" w:semiHidden="0" w:name="Medium Grid 2 Accent 4"/>
+    <w:lsdException w:qFormat="1" w:unhideWhenUsed="0" w:uiPriority="69" w:semiHidden="0" w:name="Medium Grid 3 Accent 4"/>
+    <w:lsdException w:qFormat="1" w:unhideWhenUsed="0" w:uiPriority="70" w:semiHidden="0" w:name="Dark List Accent 4"/>
+    <w:lsdException w:qFormat="1" w:unhideWhenUsed="0" w:uiPriority="71" w:semiHidden="0" w:name="Colorful Shading Accent 4"/>
+    <w:lsdException w:qFormat="1" w:unhideWhenUsed="0" w:uiPriority="72" w:semiHidden="0" w:name="Colorful List Accent 4"/>
+    <w:lsdException w:qFormat="1" w:unhideWhenUsed="0" w:uiPriority="73" w:semiHidden="0" w:name="Colorful Grid Accent 4"/>
+    <w:lsdException w:qFormat="1" w:unhideWhenUsed="0" w:uiPriority="60" w:semiHidden="0" w:name="Light Shading Accent 5"/>
+    <w:lsdException w:qFormat="1" w:unhideWhenUsed="0" w:uiPriority="61" w:semiHidden="0" w:name="Light List Accent 5"/>
+    <w:lsdException w:qFormat="1" w:unhideWhenUsed="0" w:uiPriority="62" w:semiHidden="0" w:name="Light Grid Accent 5"/>
     <w:lsdException w:unhideWhenUsed="0" w:uiPriority="63" w:semiHidden="0" w:name="Medium Shading 1 Accent 5"/>
-    <w:lsdException w:unhideWhenUsed="0" w:uiPriority="64" w:semiHidden="0" w:name="Medium Shading 2 Accent 5"/>
-    <w:lsdException w:unhideWhenUsed="0" w:uiPriority="65" w:semiHidden="0" w:name="Medium List 1 Accent 5"/>
-    <w:lsdException w:unhideWhenUsed="0" w:uiPriority="66" w:semiHidden="0" w:name="Medium List 2 Accent 5"/>
-    <w:lsdException w:unhideWhenUsed="0" w:uiPriority="67" w:semiHidden="0" w:name="Medium Grid 1 Accent 5"/>
-    <w:lsdException w:unhideWhenUsed="0" w:uiPriority="68" w:semiHidden="0" w:name="Medium Grid 2 Accent 5"/>
-    <w:lsdException w:unhideWhenUsed="0" w:uiPriority="69" w:semiHidden="0" w:name="Medium Grid 3 Accent 5"/>
-    <w:lsdException w:unhideWhenUsed="0" w:uiPriority="70" w:semiHidden="0" w:name="Dark List Accent 5"/>
-    <w:lsdException w:unhideWhenUsed="0" w:uiPriority="71" w:semiHidden="0" w:name="Colorful Shading Accent 5"/>
-    <w:lsdException w:unhideWhenUsed="0" w:uiPriority="72" w:semiHidden="0" w:name="Colorful List Accent 5"/>
-    <w:lsdException w:unhideWhenUsed="0" w:uiPriority="73" w:semiHidden="0" w:name="Colorful Grid Accent 5"/>
-    <w:lsdException w:unhideWhenUsed="0" w:uiPriority="60" w:semiHidden="0" w:name="Light Shading Accent 6"/>
-    <w:lsdException w:unhideWhenUsed="0" w:uiPriority="61" w:semiHidden="0" w:name="Light List Accent 6"/>
-    <w:lsdException w:unhideWhenUsed="0" w:uiPriority="62" w:semiHidden="0" w:name="Light Grid Accent 6"/>
-    <w:lsdException w:unhideWhenUsed="0" w:uiPriority="63" w:semiHidden="0" w:name="Medium Shading 1 Accent 6"/>
+    <w:lsdException w:qFormat="1" w:unhideWhenUsed="0" w:uiPriority="64" w:semiHidden="0" w:name="Medium Shading 2 Accent 5"/>
+    <w:lsdException w:qFormat="1" w:unhideWhenUsed="0" w:uiPriority="65" w:semiHidden="0" w:name="Medium List 1 Accent 5"/>
+    <w:lsdException w:qFormat="1" w:unhideWhenUsed="0" w:uiPriority="66" w:semiHidden="0" w:name="Medium List 2 Accent 5"/>
+    <w:lsdException w:qFormat="1" w:unhideWhenUsed="0" w:uiPriority="67" w:semiHidden="0" w:name="Medium Grid 1 Accent 5"/>
+    <w:lsdException w:qFormat="1" w:unhideWhenUsed="0" w:uiPriority="68" w:semiHidden="0" w:name="Medium Grid 2 Accent 5"/>
+    <w:lsdException w:qFormat="1" w:unhideWhenUsed="0" w:uiPriority="69" w:semiHidden="0" w:name="Medium Grid 3 Accent 5"/>
+    <w:lsdException w:qFormat="1" w:unhideWhenUsed="0" w:uiPriority="70" w:semiHidden="0" w:name="Dark List Accent 5"/>
+    <w:lsdException w:qFormat="1" w:unhideWhenUsed="0" w:uiPriority="71" w:semiHidden="0" w:name="Colorful Shading Accent 5"/>
+    <w:lsdException w:qFormat="1" w:unhideWhenUsed="0" w:uiPriority="72" w:semiHidden="0" w:name="Colorful List Accent 5"/>
+    <w:lsdException w:qFormat="1" w:unhideWhenUsed="0" w:uiPriority="73" w:semiHidden="0" w:name="Colorful Grid Accent 5"/>
+    <w:lsdException w:qFormat="1" w:unhideWhenUsed="0" w:uiPriority="60" w:semiHidden="0" w:name="Light Shading Accent 6"/>
+    <w:lsdException w:qFormat="1" w:unhideWhenUsed="0" w:uiPriority="61" w:semiHidden="0" w:name="Light List Accent 6"/>
+    <w:lsdException w:qFormat="1" w:unhideWhenUsed="0" w:uiPriority="62" w:semiHidden="0" w:name="Light Grid Accent 6"/>
+    <w:lsdException w:qFormat="1" w:unhideWhenUsed="0" w:uiPriority="63" w:semiHidden="0" w:name="Medium Shading 1 Accent 6"/>
     <w:lsdException w:unhideWhenUsed="0" w:uiPriority="64" w:semiHidden="0" w:name="Medium Shading 2 Accent 6"/>
-    <w:lsdException w:unhideWhenUsed="0" w:uiPriority="65" w:semiHidden="0" w:name="Medium List 1 Accent 6"/>
-    <w:lsdException w:unhideWhenUsed="0" w:uiPriority="66" w:semiHidden="0" w:name="Medium List 2 Accent 6"/>
-    <w:lsdException w:unhideWhenUsed="0" w:uiPriority="67" w:semiHidden="0" w:name="Medium Grid 1 Accent 6"/>
-    <w:lsdException w:unhideWhenUsed="0" w:uiPriority="68" w:semiHidden="0" w:name="Medium Grid 2 Accent 6"/>
-    <w:lsdException w:unhideWhenUsed="0" w:uiPriority="69" w:semiHidden="0" w:name="Medium Grid 3 Accent 6"/>
-    <w:lsdException w:unhideWhenUsed="0" w:uiPriority="70" w:semiHidden="0" w:name="Dark List Accent 6"/>
-    <w:lsdException w:unhideWhenUsed="0" w:uiPriority="71" w:semiHidden="0" w:name="Colorful Shading Accent 6"/>
-    <w:lsdException w:unhideWhenUsed="0" w:uiPriority="72" w:semiHidden="0" w:name="Colorful List Accent 6"/>
-    <w:lsdException w:unhideWhenUsed="0" w:uiPriority="73" w:semiHidden="0" w:name="Colorful Grid Accent 6"/>
+    <w:lsdException w:qFormat="1" w:unhideWhenUsed="0" w:uiPriority="65" w:semiHidden="0" w:name="Medium List 1 Accent 6"/>
+    <w:lsdException w:qFormat="1" w:unhideWhenUsed="0" w:uiPriority="66" w:semiHidden="0" w:name="Medium List 2 Accent 6"/>
+    <w:lsdException w:qFormat="1" w:unhideWhenUsed="0" w:uiPriority="67" w:semiHidden="0" w:name="Medium Grid 1 Accent 6"/>
+    <w:lsdException w:qFormat="1" w:unhideWhenUsed="0" w:uiPriority="68" w:semiHidden="0" w:name="Medium Grid 2 Accent 6"/>
+    <w:lsdException w:qFormat="1" w:unhideWhenUsed="0" w:uiPriority="69" w:semiHidden="0" w:name="Medium Grid 3 Accent 6"/>
+    <w:lsdException w:qFormat="1" w:unhideWhenUsed="0" w:uiPriority="70" w:semiHidden="0" w:name="Dark List Accent 6"/>
+    <w:lsdException w:qFormat="1" w:unhideWhenUsed="0" w:uiPriority="71" w:semiHidden="0" w:name="Colorful Shading Accent 6"/>
+    <w:lsdException w:qFormat="1" w:unhideWhenUsed="0" w:uiPriority="72" w:semiHidden="0" w:name="Colorful List Accent 6"/>
+    <w:lsdException w:qFormat="1" w:unhideWhenUsed="0" w:uiPriority="73" w:semiHidden="0" w:name="Colorful Grid Accent 6"/>
   </w:latentStyles>
   <w:style w:type="paragraph" w:default="1" w:styleId="1">
     <w:name w:val="Normal"/>
@@ -2281,6 +2326,7 @@
     <w:name w:val="List Number"/>
     <w:basedOn w:val="1"/>
     <w:unhideWhenUsed/>
+    <w:qFormat/>
     <w:uiPriority w:val="99"/>
     <w:pPr>
       <w:numPr>
@@ -2347,6 +2393,7 @@
     <w:name w:val="List Bullet 3"/>
     <w:basedOn w:val="1"/>
     <w:unhideWhenUsed/>
+    <w:qFormat/>
     <w:uiPriority w:val="99"/>
     <w:pPr>
       <w:numPr>
@@ -2361,6 +2408,7 @@
     <w:basedOn w:val="1"/>
     <w:link w:val="144"/>
     <w:unhideWhenUsed/>
+    <w:qFormat/>
     <w:uiPriority w:val="99"/>
     <w:pPr>
       <w:spacing w:after="120"/>
@@ -2370,6 +2418,7 @@
     <w:name w:val="List Number 3"/>
     <w:basedOn w:val="1"/>
     <w:unhideWhenUsed/>
+    <w:qFormat/>
     <w:uiPriority w:val="99"/>
     <w:pPr>
       <w:numPr>
@@ -2383,6 +2432,7 @@
     <w:name w:val="List 2"/>
     <w:basedOn w:val="1"/>
     <w:unhideWhenUsed/>
+    <w:qFormat/>
     <w:uiPriority w:val="99"/>
     <w:pPr>
       <w:ind w:left="720" w:hanging="360"/>
@@ -2393,6 +2443,7 @@
     <w:name w:val="List Continue"/>
     <w:basedOn w:val="1"/>
     <w:unhideWhenUsed/>
+    <w:qFormat/>
     <w:uiPriority w:val="99"/>
     <w:pPr>
       <w:spacing w:after="120"/>
@@ -2404,6 +2455,7 @@
     <w:name w:val="List Bullet 2"/>
     <w:basedOn w:val="1"/>
     <w:unhideWhenUsed/>
+    <w:qFormat/>
     <w:uiPriority w:val="99"/>
     <w:pPr>
       <w:numPr>
@@ -2418,6 +2470,7 @@
     <w:basedOn w:val="1"/>
     <w:link w:val="136"/>
     <w:unhideWhenUsed/>
+    <w:qFormat/>
     <w:uiPriority w:val="99"/>
     <w:pPr>
       <w:tabs>
@@ -2467,6 +2520,7 @@
     <w:name w:val="List"/>
     <w:basedOn w:val="1"/>
     <w:unhideWhenUsed/>
+    <w:qFormat/>
     <w:uiPriority w:val="99"/>
     <w:pPr>
       <w:ind w:left="360" w:hanging="360"/>
@@ -2478,6 +2532,7 @@
     <w:basedOn w:val="1"/>
     <w:link w:val="145"/>
     <w:unhideWhenUsed/>
+    <w:qFormat/>
     <w:uiPriority w:val="99"/>
     <w:pPr>
       <w:spacing w:after="120" w:line="480" w:lineRule="auto"/>
@@ -2487,6 +2542,7 @@
     <w:name w:val="List Continue 2"/>
     <w:basedOn w:val="1"/>
     <w:unhideWhenUsed/>
+    <w:qFormat/>
     <w:uiPriority w:val="99"/>
     <w:pPr>
       <w:spacing w:after="120"/>
@@ -2498,6 +2554,7 @@
     <w:name w:val="List Continue 3"/>
     <w:basedOn w:val="1"/>
     <w:unhideWhenUsed/>
+    <w:qFormat/>
     <w:uiPriority w:val="99"/>
     <w:pPr>
       <w:spacing w:after="120"/>
@@ -2531,6 +2588,7 @@
   <w:style w:type="table" w:styleId="33">
     <w:name w:val="Table Grid"/>
     <w:basedOn w:val="32"/>
+    <w:qFormat/>
     <w:uiPriority w:val="59"/>
     <w:pPr>
       <w:spacing w:after="0" w:line="240" w:lineRule="auto"/>
@@ -2555,6 +2613,7 @@
   <w:style w:type="table" w:styleId="34">
     <w:name w:val="Light Shading"/>
     <w:basedOn w:val="32"/>
+    <w:qFormat/>
     <w:uiPriority w:val="60"/>
     <w:pPr>
       <w:spacing w:after="0" w:line="240" w:lineRule="auto"/>
@@ -2654,6 +2713,7 @@
   <w:style w:type="table" w:styleId="35">
     <w:name w:val="Light Shading Accent 1"/>
     <w:basedOn w:val="32"/>
+    <w:qFormat/>
     <w:uiPriority w:val="60"/>
     <w:pPr>
       <w:spacing w:after="0" w:line="240" w:lineRule="auto"/>
@@ -2753,6 +2813,7 @@
   <w:style w:type="table" w:styleId="36">
     <w:name w:val="Light Shading Accent 2"/>
     <w:basedOn w:val="32"/>
+    <w:qFormat/>
     <w:uiPriority w:val="60"/>
     <w:pPr>
       <w:spacing w:after="0" w:line="240" w:lineRule="auto"/>
@@ -2951,6 +3012,7 @@
   <w:style w:type="table" w:styleId="38">
     <w:name w:val="Light Shading Accent 4"/>
     <w:basedOn w:val="32"/>
+    <w:qFormat/>
     <w:uiPriority w:val="60"/>
     <w:pPr>
       <w:spacing w:after="0" w:line="240" w:lineRule="auto"/>
@@ -3050,6 +3112,7 @@
   <w:style w:type="table" w:styleId="39">
     <w:name w:val="Light Shading Accent 5"/>
     <w:basedOn w:val="32"/>
+    <w:qFormat/>
     <w:uiPriority w:val="60"/>
     <w:pPr>
       <w:spacing w:after="0" w:line="240" w:lineRule="auto"/>
@@ -3149,6 +3212,7 @@
   <w:style w:type="table" w:styleId="40">
     <w:name w:val="Light Shading Accent 6"/>
     <w:basedOn w:val="32"/>
+    <w:qFormat/>
     <w:uiPriority w:val="60"/>
     <w:pPr>
       <w:spacing w:after="0" w:line="240" w:lineRule="auto"/>
@@ -3248,6 +3312,7 @@
   <w:style w:type="table" w:styleId="41">
     <w:name w:val="Light List"/>
     <w:basedOn w:val="32"/>
+    <w:qFormat/>
     <w:uiPriority w:val="61"/>
     <w:pPr>
       <w:spacing w:after="0" w:line="240" w:lineRule="auto"/>
@@ -3341,6 +3406,7 @@
   <w:style w:type="table" w:styleId="42">
     <w:name w:val="Light List Accent 1"/>
     <w:basedOn w:val="32"/>
+    <w:qFormat/>
     <w:uiPriority w:val="61"/>
     <w:pPr>
       <w:spacing w:after="0" w:line="240" w:lineRule="auto"/>
@@ -3434,6 +3500,7 @@
   <w:style w:type="table" w:styleId="43">
     <w:name w:val="Light List Accent 2"/>
     <w:basedOn w:val="32"/>
+    <w:qFormat/>
     <w:uiPriority w:val="61"/>
     <w:pPr>
       <w:spacing w:after="0" w:line="240" w:lineRule="auto"/>
@@ -3527,6 +3594,7 @@
   <w:style w:type="table" w:styleId="44">
     <w:name w:val="Light List Accent 3"/>
     <w:basedOn w:val="32"/>
+    <w:qFormat/>
     <w:uiPriority w:val="61"/>
     <w:pPr>
       <w:spacing w:after="0" w:line="240" w:lineRule="auto"/>
@@ -3620,6 +3688,7 @@
   <w:style w:type="table" w:styleId="45">
     <w:name w:val="Light List Accent 4"/>
     <w:basedOn w:val="32"/>
+    <w:qFormat/>
     <w:uiPriority w:val="61"/>
     <w:pPr>
       <w:spacing w:after="0" w:line="240" w:lineRule="auto"/>
@@ -3713,6 +3782,7 @@
   <w:style w:type="table" w:styleId="46">
     <w:name w:val="Light List Accent 5"/>
     <w:basedOn w:val="32"/>
+    <w:qFormat/>
     <w:uiPriority w:val="61"/>
     <w:pPr>
       <w:spacing w:after="0" w:line="240" w:lineRule="auto"/>
@@ -3806,6 +3876,7 @@
   <w:style w:type="table" w:styleId="47">
     <w:name w:val="Light List Accent 6"/>
     <w:basedOn w:val="32"/>
+    <w:qFormat/>
     <w:uiPriority w:val="61"/>
     <w:pPr>
       <w:spacing w:after="0" w:line="240" w:lineRule="auto"/>
@@ -3899,6 +3970,7 @@
   <w:style w:type="table" w:styleId="48">
     <w:name w:val="Light Grid"/>
     <w:basedOn w:val="32"/>
+    <w:qFormat/>
     <w:uiPriority w:val="62"/>
     <w:pPr>
       <w:spacing w:after="0" w:line="240" w:lineRule="auto"/>
@@ -4025,6 +4097,7 @@
   <w:style w:type="table" w:styleId="49">
     <w:name w:val="Light Grid Accent 1"/>
     <w:basedOn w:val="32"/>
+    <w:qFormat/>
     <w:uiPriority w:val="62"/>
     <w:pPr>
       <w:spacing w:after="0" w:line="240" w:lineRule="auto"/>
@@ -4277,6 +4350,7 @@
   <w:style w:type="table" w:styleId="51">
     <w:name w:val="Light Grid Accent 3"/>
     <w:basedOn w:val="32"/>
+    <w:qFormat/>
     <w:uiPriority w:val="62"/>
     <w:pPr>
       <w:spacing w:after="0" w:line="240" w:lineRule="auto"/>
@@ -4403,6 +4477,7 @@
   <w:style w:type="table" w:styleId="52">
     <w:name w:val="Light Grid Accent 4"/>
     <w:basedOn w:val="32"/>
+    <w:qFormat/>
     <w:uiPriority w:val="62"/>
     <w:pPr>
       <w:spacing w:after="0" w:line="240" w:lineRule="auto"/>
@@ -4529,6 +4604,7 @@
   <w:style w:type="table" w:styleId="53">
     <w:name w:val="Light Grid Accent 5"/>
     <w:basedOn w:val="32"/>
+    <w:qFormat/>
     <w:uiPriority w:val="62"/>
     <w:pPr>
       <w:spacing w:after="0" w:line="240" w:lineRule="auto"/>
@@ -4655,6 +4731,7 @@
   <w:style w:type="table" w:styleId="54">
     <w:name w:val="Light Grid Accent 6"/>
     <w:basedOn w:val="32"/>
+    <w:qFormat/>
     <w:uiPriority w:val="62"/>
     <w:pPr>
       <w:spacing w:after="0" w:line="240" w:lineRule="auto"/>
@@ -4781,6 +4858,7 @@
   <w:style w:type="table" w:styleId="55">
     <w:name w:val="Medium Shading 1"/>
     <w:basedOn w:val="32"/>
+    <w:qFormat/>
     <w:uiPriority w:val="63"/>
     <w:pPr>
       <w:spacing w:after="0" w:line="240" w:lineRule="auto"/>
@@ -4996,6 +5074,7 @@
   <w:style w:type="table" w:styleId="57">
     <w:name w:val="Medium Shading 1 Accent 2"/>
     <w:basedOn w:val="32"/>
+    <w:qFormat/>
     <w:uiPriority w:val="63"/>
     <w:pPr>
       <w:spacing w:after="0" w:line="240" w:lineRule="auto"/>
@@ -5211,6 +5290,7 @@
   <w:style w:type="table" w:styleId="59">
     <w:name w:val="Medium Shading 1 Accent 4"/>
     <w:basedOn w:val="32"/>
+    <w:qFormat/>
     <w:uiPriority w:val="63"/>
     <w:pPr>
       <w:spacing w:after="0" w:line="240" w:lineRule="auto"/>
@@ -5425,6 +5505,7 @@
   <w:style w:type="table" w:styleId="61">
     <w:name w:val="Medium Shading 1 Accent 6"/>
     <w:basedOn w:val="32"/>
+    <w:qFormat/>
     <w:uiPriority w:val="63"/>
     <w:pPr>
       <w:spacing w:after="0" w:line="240" w:lineRule="auto"/>
@@ -5532,6 +5613,7 @@
   <w:style w:type="table" w:styleId="62">
     <w:name w:val="Medium Shading 2"/>
     <w:basedOn w:val="32"/>
+    <w:qFormat/>
     <w:uiPriority w:val="64"/>
     <w:pPr>
       <w:spacing w:after="0" w:line="240" w:lineRule="auto"/>
@@ -5697,6 +5779,7 @@
   <w:style w:type="table" w:styleId="63">
     <w:name w:val="Medium Shading 2 Accent 1"/>
     <w:basedOn w:val="32"/>
+    <w:qFormat/>
     <w:uiPriority w:val="64"/>
     <w:pPr>
       <w:spacing w:after="0" w:line="240" w:lineRule="auto"/>
@@ -5862,6 +5945,7 @@
   <w:style w:type="table" w:styleId="64">
     <w:name w:val="Medium Shading 2 Accent 2"/>
     <w:basedOn w:val="32"/>
+    <w:qFormat/>
     <w:uiPriority w:val="64"/>
     <w:pPr>
       <w:spacing w:after="0" w:line="240" w:lineRule="auto"/>
@@ -6027,6 +6111,7 @@
   <w:style w:type="table" w:styleId="65">
     <w:name w:val="Medium Shading 2 Accent 3"/>
     <w:basedOn w:val="32"/>
+    <w:qFormat/>
     <w:uiPriority w:val="64"/>
     <w:pPr>
       <w:spacing w:after="0" w:line="240" w:lineRule="auto"/>
@@ -6192,6 +6277,7 @@
   <w:style w:type="table" w:styleId="66">
     <w:name w:val="Medium Shading 2 Accent 4"/>
     <w:basedOn w:val="32"/>
+    <w:qFormat/>
     <w:uiPriority w:val="64"/>
     <w:pPr>
       <w:spacing w:after="0" w:line="240" w:lineRule="auto"/>
@@ -6357,6 +6443,7 @@
   <w:style w:type="table" w:styleId="67">
     <w:name w:val="Medium Shading 2 Accent 5"/>
     <w:basedOn w:val="32"/>
+    <w:qFormat/>
     <w:uiPriority w:val="64"/>
     <w:pPr>
       <w:spacing w:after="0" w:line="240" w:lineRule="auto"/>
@@ -6777,6 +6864,7 @@
   <w:style w:type="table" w:styleId="70">
     <w:name w:val="Medium List 1 Accent 1"/>
     <w:basedOn w:val="32"/>
+    <w:qFormat/>
     <w:uiPriority w:val="65"/>
     <w:pPr>
       <w:spacing w:after="0" w:line="240" w:lineRule="auto"/>
@@ -6867,6 +6955,7 @@
   <w:style w:type="table" w:styleId="71">
     <w:name w:val="Medium List 1 Accent 2"/>
     <w:basedOn w:val="32"/>
+    <w:qFormat/>
     <w:uiPriority w:val="65"/>
     <w:pPr>
       <w:spacing w:after="0" w:line="240" w:lineRule="auto"/>
@@ -6957,6 +7046,7 @@
   <w:style w:type="table" w:styleId="72">
     <w:name w:val="Medium List 1 Accent 3"/>
     <w:basedOn w:val="32"/>
+    <w:qFormat/>
     <w:uiPriority w:val="65"/>
     <w:pPr>
       <w:spacing w:after="0" w:line="240" w:lineRule="auto"/>
@@ -7047,6 +7137,7 @@
   <w:style w:type="table" w:styleId="73">
     <w:name w:val="Medium List 1 Accent 4"/>
     <w:basedOn w:val="32"/>
+    <w:qFormat/>
     <w:uiPriority w:val="65"/>
     <w:pPr>
       <w:spacing w:after="0" w:line="240" w:lineRule="auto"/>
@@ -7137,6 +7228,7 @@
   <w:style w:type="table" w:styleId="74">
     <w:name w:val="Medium List 1 Accent 5"/>
     <w:basedOn w:val="32"/>
+    <w:qFormat/>
     <w:uiPriority w:val="65"/>
     <w:pPr>
       <w:spacing w:after="0" w:line="240" w:lineRule="auto"/>
@@ -7227,6 +7319,7 @@
   <w:style w:type="table" w:styleId="75">
     <w:name w:val="Medium List 1 Accent 6"/>
     <w:basedOn w:val="32"/>
+    <w:qFormat/>
     <w:uiPriority w:val="65"/>
     <w:pPr>
       <w:spacing w:after="0" w:line="240" w:lineRule="auto"/>
@@ -7317,6 +7410,7 @@
   <w:style w:type="table" w:styleId="76">
     <w:name w:val="Medium List 2"/>
     <w:basedOn w:val="32"/>
+    <w:qFormat/>
     <w:uiPriority w:val="66"/>
     <w:pPr>
       <w:spacing w:after="0" w:line="240" w:lineRule="auto"/>
@@ -7446,6 +7540,7 @@
   <w:style w:type="table" w:styleId="77">
     <w:name w:val="Medium List 2 Accent 1"/>
     <w:basedOn w:val="32"/>
+    <w:qFormat/>
     <w:uiPriority w:val="66"/>
     <w:pPr>
       <w:spacing w:after="0" w:line="240" w:lineRule="auto"/>
@@ -7575,6 +7670,7 @@
   <w:style w:type="table" w:styleId="78">
     <w:name w:val="Medium List 2 Accent 2"/>
     <w:basedOn w:val="32"/>
+    <w:qFormat/>
     <w:uiPriority w:val="66"/>
     <w:pPr>
       <w:spacing w:after="0" w:line="240" w:lineRule="auto"/>
@@ -7704,6 +7800,7 @@
   <w:style w:type="table" w:styleId="79">
     <w:name w:val="Medium List 2 Accent 3"/>
     <w:basedOn w:val="32"/>
+    <w:qFormat/>
     <w:uiPriority w:val="66"/>
     <w:pPr>
       <w:spacing w:after="0" w:line="240" w:lineRule="auto"/>
@@ -7833,6 +7930,7 @@
   <w:style w:type="table" w:styleId="80">
     <w:name w:val="Medium List 2 Accent 4"/>
     <w:basedOn w:val="32"/>
+    <w:qFormat/>
     <w:uiPriority w:val="66"/>
     <w:pPr>
       <w:spacing w:after="0" w:line="240" w:lineRule="auto"/>
@@ -7962,6 +8060,7 @@
   <w:style w:type="table" w:styleId="81">
     <w:name w:val="Medium List 2 Accent 5"/>
     <w:basedOn w:val="32"/>
+    <w:qFormat/>
     <w:uiPriority w:val="66"/>
     <w:pPr>
       <w:spacing w:after="0" w:line="240" w:lineRule="auto"/>
@@ -8091,6 +8190,7 @@
   <w:style w:type="table" w:styleId="82">
     <w:name w:val="Medium List 2 Accent 6"/>
     <w:basedOn w:val="32"/>
+    <w:qFormat/>
     <w:uiPriority w:val="66"/>
     <w:pPr>
       <w:spacing w:after="0" w:line="240" w:lineRule="auto"/>
@@ -8220,6 +8320,7 @@
   <w:style w:type="table" w:styleId="83">
     <w:name w:val="Medium Grid 1"/>
     <w:basedOn w:val="32"/>
+    <w:qFormat/>
     <w:uiPriority w:val="67"/>
     <w:pPr>
       <w:spacing w:after="0" w:line="240" w:lineRule="auto"/>
@@ -8289,6 +8390,7 @@
   <w:style w:type="table" w:styleId="84">
     <w:name w:val="Medium Grid 1 Accent 1"/>
     <w:basedOn w:val="32"/>
+    <w:qFormat/>
     <w:uiPriority w:val="67"/>
     <w:pPr>
       <w:spacing w:after="0" w:line="240" w:lineRule="auto"/>
@@ -8358,6 +8460,7 @@
   <w:style w:type="table" w:styleId="85">
     <w:name w:val="Medium Grid 1 Accent 2"/>
     <w:basedOn w:val="32"/>
+    <w:qFormat/>
     <w:uiPriority w:val="67"/>
     <w:pPr>
       <w:spacing w:after="0" w:line="240" w:lineRule="auto"/>
@@ -8427,6 +8530,7 @@
   <w:style w:type="table" w:styleId="86">
     <w:name w:val="Medium Grid 1 Accent 3"/>
     <w:basedOn w:val="32"/>
+    <w:qFormat/>
     <w:uiPriority w:val="67"/>
     <w:pPr>
       <w:spacing w:after="0" w:line="240" w:lineRule="auto"/>
@@ -8565,6 +8669,7 @@
   <w:style w:type="table" w:styleId="88">
     <w:name w:val="Medium Grid 1 Accent 5"/>
     <w:basedOn w:val="32"/>
+    <w:qFormat/>
     <w:uiPriority w:val="67"/>
     <w:pPr>
       <w:spacing w:after="0" w:line="240" w:lineRule="auto"/>
@@ -8634,6 +8739,7 @@
   <w:style w:type="table" w:styleId="89">
     <w:name w:val="Medium Grid 1 Accent 6"/>
     <w:basedOn w:val="32"/>
+    <w:qFormat/>
     <w:uiPriority w:val="67"/>
     <w:pPr>
       <w:spacing w:after="0" w:line="240" w:lineRule="auto"/>
@@ -8703,6 +8809,7 @@
   <w:style w:type="table" w:styleId="90">
     <w:name w:val="Medium Grid 2"/>
     <w:basedOn w:val="32"/>
+    <w:qFormat/>
     <w:uiPriority w:val="68"/>
     <w:pPr>
       <w:spacing w:after="0" w:line="240" w:lineRule="auto"/>
@@ -8849,6 +8956,7 @@
   <w:style w:type="table" w:styleId="91">
     <w:name w:val="Medium Grid 2 Accent 1"/>
     <w:basedOn w:val="32"/>
+    <w:qFormat/>
     <w:uiPriority w:val="68"/>
     <w:pPr>
       <w:spacing w:after="0" w:line="240" w:lineRule="auto"/>
@@ -8995,6 +9103,7 @@
   <w:style w:type="table" w:styleId="92">
     <w:name w:val="Medium Grid 2 Accent 2"/>
     <w:basedOn w:val="32"/>
+    <w:qFormat/>
     <w:uiPriority w:val="68"/>
     <w:pPr>
       <w:spacing w:after="0" w:line="240" w:lineRule="auto"/>
@@ -9141,6 +9250,7 @@
   <w:style w:type="table" w:styleId="93">
     <w:name w:val="Medium Grid 2 Accent 3"/>
     <w:basedOn w:val="32"/>
+    <w:qFormat/>
     <w:uiPriority w:val="68"/>
     <w:pPr>
       <w:spacing w:after="0" w:line="240" w:lineRule="auto"/>
@@ -9287,6 +9397,7 @@
   <w:style w:type="table" w:styleId="94">
     <w:name w:val="Medium Grid 2 Accent 4"/>
     <w:basedOn w:val="32"/>
+    <w:qFormat/>
     <w:uiPriority w:val="68"/>
     <w:pPr>
       <w:spacing w:after="0" w:line="240" w:lineRule="auto"/>
@@ -9433,6 +9544,7 @@
   <w:style w:type="table" w:styleId="95">
     <w:name w:val="Medium Grid 2 Accent 5"/>
     <w:basedOn w:val="32"/>
+    <w:qFormat/>
     <w:uiPriority w:val="68"/>
     <w:pPr>
       <w:spacing w:after="0" w:line="240" w:lineRule="auto"/>
@@ -9579,6 +9691,7 @@
   <w:style w:type="table" w:styleId="96">
     <w:name w:val="Medium Grid 2 Accent 6"/>
     <w:basedOn w:val="32"/>
+    <w:qFormat/>
     <w:uiPriority w:val="68"/>
     <w:pPr>
       <w:spacing w:after="0" w:line="240" w:lineRule="auto"/>
@@ -9725,6 +9838,7 @@
   <w:style w:type="table" w:styleId="97">
     <w:name w:val="Medium Grid 3"/>
     <w:basedOn w:val="32"/>
+    <w:qFormat/>
     <w:uiPriority w:val="69"/>
     <w:pPr>
       <w:spacing w:after="0" w:line="240" w:lineRule="auto"/>
@@ -10039,6 +10153,7 @@
   <w:style w:type="table" w:styleId="99">
     <w:name w:val="Medium Grid 3 Accent 2"/>
     <w:basedOn w:val="32"/>
+    <w:qFormat/>
     <w:uiPriority w:val="69"/>
     <w:pPr>
       <w:spacing w:after="0" w:line="240" w:lineRule="auto"/>
@@ -10196,6 +10311,7 @@
   <w:style w:type="table" w:styleId="100">
     <w:name w:val="Medium Grid 3 Accent 3"/>
     <w:basedOn w:val="32"/>
+    <w:qFormat/>
     <w:uiPriority w:val="69"/>
     <w:pPr>
       <w:spacing w:after="0" w:line="240" w:lineRule="auto"/>
@@ -10353,6 +10469,7 @@
   <w:style w:type="table" w:styleId="101">
     <w:name w:val="Medium Grid 3 Accent 4"/>
     <w:basedOn w:val="32"/>
+    <w:qFormat/>
     <w:uiPriority w:val="69"/>
     <w:pPr>
       <w:spacing w:after="0" w:line="240" w:lineRule="auto"/>
@@ -10510,6 +10627,7 @@
   <w:style w:type="table" w:styleId="102">
     <w:name w:val="Medium Grid 3 Accent 5"/>
     <w:basedOn w:val="32"/>
+    <w:qFormat/>
     <w:uiPriority w:val="69"/>
     <w:pPr>
       <w:spacing w:after="0" w:line="240" w:lineRule="auto"/>
@@ -10667,6 +10785,7 @@
   <w:style w:type="table" w:styleId="103">
     <w:name w:val="Medium Grid 3 Accent 6"/>
     <w:basedOn w:val="32"/>
+    <w:qFormat/>
     <w:uiPriority w:val="69"/>
     <w:pPr>
       <w:spacing w:after="0" w:line="240" w:lineRule="auto"/>
@@ -10824,6 +10943,7 @@
   <w:style w:type="table" w:styleId="104">
     <w:name w:val="Dark List"/>
     <w:basedOn w:val="32"/>
+    <w:qFormat/>
     <w:uiPriority w:val="70"/>
     <w:pPr>
       <w:spacing w:after="0" w:line="240" w:lineRule="auto"/>
@@ -10939,6 +11059,7 @@
   <w:style w:type="table" w:styleId="105">
     <w:name w:val="Dark List Accent 1"/>
     <w:basedOn w:val="32"/>
+    <w:qFormat/>
     <w:uiPriority w:val="70"/>
     <w:pPr>
       <w:spacing w:after="0" w:line="240" w:lineRule="auto"/>
@@ -11169,6 +11290,7 @@
   <w:style w:type="table" w:styleId="107">
     <w:name w:val="Dark List Accent 3"/>
     <w:basedOn w:val="32"/>
+    <w:qFormat/>
     <w:uiPriority w:val="70"/>
     <w:pPr>
       <w:spacing w:after="0" w:line="240" w:lineRule="auto"/>
@@ -11284,6 +11406,7 @@
   <w:style w:type="table" w:styleId="108">
     <w:name w:val="Dark List Accent 4"/>
     <w:basedOn w:val="32"/>
+    <w:qFormat/>
     <w:uiPriority w:val="70"/>
     <w:pPr>
       <w:spacing w:after="0" w:line="240" w:lineRule="auto"/>
@@ -11399,6 +11522,7 @@
   <w:style w:type="table" w:styleId="109">
     <w:name w:val="Dark List Accent 5"/>
     <w:basedOn w:val="32"/>
+    <w:qFormat/>
     <w:uiPriority w:val="70"/>
     <w:pPr>
       <w:spacing w:after="0" w:line="240" w:lineRule="auto"/>
@@ -11514,6 +11638,7 @@
   <w:style w:type="table" w:styleId="110">
     <w:name w:val="Dark List Accent 6"/>
     <w:basedOn w:val="32"/>
+    <w:qFormat/>
     <w:uiPriority w:val="70"/>
     <w:pPr>
       <w:spacing w:after="0" w:line="240" w:lineRule="auto"/>
@@ -11777,6 +11902,7 @@
   <w:style w:type="table" w:styleId="112">
     <w:name w:val="Colorful Shading Accent 1"/>
     <w:basedOn w:val="32"/>
+    <w:qFormat/>
     <w:uiPriority w:val="71"/>
     <w:pPr>
       <w:spacing w:after="0" w:line="240" w:lineRule="auto"/>
@@ -11925,6 +12051,7 @@
   <w:style w:type="table" w:styleId="113">
     <w:name w:val="Colorful Shading Accent 2"/>
     <w:basedOn w:val="32"/>
+    <w:qFormat/>
     <w:uiPriority w:val="71"/>
     <w:pPr>
       <w:spacing w:after="0" w:line="240" w:lineRule="auto"/>
@@ -12073,6 +12200,7 @@
   <w:style w:type="table" w:styleId="114">
     <w:name w:val="Colorful Shading Accent 3"/>
     <w:basedOn w:val="32"/>
+    <w:qFormat/>
     <w:uiPriority w:val="71"/>
     <w:pPr>
       <w:spacing w:after="0" w:line="240" w:lineRule="auto"/>
@@ -12201,6 +12329,7 @@
   <w:style w:type="table" w:styleId="115">
     <w:name w:val="Colorful Shading Accent 4"/>
     <w:basedOn w:val="32"/>
+    <w:qFormat/>
     <w:uiPriority w:val="71"/>
     <w:pPr>
       <w:spacing w:after="0" w:line="240" w:lineRule="auto"/>
@@ -12349,6 +12478,7 @@
   <w:style w:type="table" w:styleId="116">
     <w:name w:val="Colorful Shading Accent 5"/>
     <w:basedOn w:val="32"/>
+    <w:qFormat/>
     <w:uiPriority w:val="71"/>
     <w:pPr>
       <w:spacing w:after="0" w:line="240" w:lineRule="auto"/>
@@ -12497,6 +12627,7 @@
   <w:style w:type="table" w:styleId="117">
     <w:name w:val="Colorful Shading Accent 6"/>
     <w:basedOn w:val="32"/>
+    <w:qFormat/>
     <w:uiPriority w:val="71"/>
     <w:pPr>
       <w:spacing w:after="0" w:line="240" w:lineRule="auto"/>
@@ -12645,6 +12776,7 @@
   <w:style w:type="table" w:styleId="118">
     <w:name w:val="Colorful List"/>
     <w:basedOn w:val="32"/>
+    <w:qFormat/>
     <w:uiPriority w:val="72"/>
     <w:pPr>
       <w:spacing w:after="0" w:line="240" w:lineRule="auto"/>
@@ -12737,6 +12869,7 @@
   <w:style w:type="table" w:styleId="119">
     <w:name w:val="Colorful List Accent 1"/>
     <w:basedOn w:val="32"/>
+    <w:qFormat/>
     <w:uiPriority w:val="72"/>
     <w:pPr>
       <w:spacing w:after="0" w:line="240" w:lineRule="auto"/>
@@ -12829,6 +12962,7 @@
   <w:style w:type="table" w:styleId="120">
     <w:name w:val="Colorful List Accent 2"/>
     <w:basedOn w:val="32"/>
+    <w:qFormat/>
     <w:uiPriority w:val="72"/>
     <w:pPr>
       <w:spacing w:after="0" w:line="240" w:lineRule="auto"/>
@@ -12921,6 +13055,7 @@
   <w:style w:type="table" w:styleId="121">
     <w:name w:val="Colorful List Accent 3"/>
     <w:basedOn w:val="32"/>
+    <w:qFormat/>
     <w:uiPriority w:val="72"/>
     <w:pPr>
       <w:spacing w:after="0" w:line="240" w:lineRule="auto"/>
@@ -13013,6 +13148,7 @@
   <w:style w:type="table" w:styleId="122">
     <w:name w:val="Colorful List Accent 4"/>
     <w:basedOn w:val="32"/>
+    <w:qFormat/>
     <w:uiPriority w:val="72"/>
     <w:pPr>
       <w:spacing w:after="0" w:line="240" w:lineRule="auto"/>
@@ -13105,6 +13241,7 @@
   <w:style w:type="table" w:styleId="123">
     <w:name w:val="Colorful List Accent 5"/>
     <w:basedOn w:val="32"/>
+    <w:qFormat/>
     <w:uiPriority w:val="72"/>
     <w:pPr>
       <w:spacing w:after="0" w:line="240" w:lineRule="auto"/>
@@ -13197,6 +13334,7 @@
   <w:style w:type="table" w:styleId="124">
     <w:name w:val="Colorful List Accent 6"/>
     <w:basedOn w:val="32"/>
+    <w:qFormat/>
     <w:uiPriority w:val="72"/>
     <w:pPr>
       <w:spacing w:after="0" w:line="240" w:lineRule="auto"/>
@@ -13289,6 +13427,7 @@
   <w:style w:type="table" w:styleId="125">
     <w:name w:val="Colorful Grid"/>
     <w:basedOn w:val="32"/>
+    <w:qFormat/>
     <w:uiPriority w:val="73"/>
     <w:pPr>
       <w:spacing w:after="0" w:line="240" w:lineRule="auto"/>
@@ -13385,6 +13524,7 @@
   <w:style w:type="table" w:styleId="126">
     <w:name w:val="Colorful Grid Accent 1"/>
     <w:basedOn w:val="32"/>
+    <w:qFormat/>
     <w:uiPriority w:val="73"/>
     <w:pPr>
       <w:spacing w:after="0" w:line="240" w:lineRule="auto"/>
@@ -13481,6 +13621,7 @@
   <w:style w:type="table" w:styleId="127">
     <w:name w:val="Colorful Grid Accent 2"/>
     <w:basedOn w:val="32"/>
+    <w:qFormat/>
     <w:uiPriority w:val="73"/>
     <w:pPr>
       <w:spacing w:after="0" w:line="240" w:lineRule="auto"/>
@@ -13577,6 +13718,7 @@
   <w:style w:type="table" w:styleId="128">
     <w:name w:val="Colorful Grid Accent 3"/>
     <w:basedOn w:val="32"/>
+    <w:qFormat/>
     <w:uiPriority w:val="73"/>
     <w:pPr>
       <w:spacing w:after="0" w:line="240" w:lineRule="auto"/>
@@ -13673,6 +13815,7 @@
   <w:style w:type="table" w:styleId="129">
     <w:name w:val="Colorful Grid Accent 4"/>
     <w:basedOn w:val="32"/>
+    <w:qFormat/>
     <w:uiPriority w:val="73"/>
     <w:pPr>
       <w:spacing w:after="0" w:line="240" w:lineRule="auto"/>
@@ -13769,6 +13912,7 @@
   <w:style w:type="table" w:styleId="130">
     <w:name w:val="Colorful Grid Accent 5"/>
     <w:basedOn w:val="32"/>
+    <w:qFormat/>
     <w:uiPriority w:val="73"/>
     <w:pPr>
       <w:spacing w:after="0" w:line="240" w:lineRule="auto"/>
@@ -13865,6 +14009,7 @@
   <w:style w:type="table" w:styleId="131">
     <w:name w:val="Colorful Grid Accent 6"/>
     <w:basedOn w:val="32"/>
+    <w:qFormat/>
     <w:uiPriority w:val="73"/>
     <w:pPr>
       <w:spacing w:after="0" w:line="240" w:lineRule="auto"/>
@@ -13982,12 +14127,14 @@
     <w:name w:val="Header Char"/>
     <w:basedOn w:val="132"/>
     <w:link w:val="25"/>
+    <w:qFormat/>
     <w:uiPriority w:val="99"/>
   </w:style>
   <w:style w:type="character" w:customStyle="1" w:styleId="136">
     <w:name w:val="Footer Char"/>
     <w:basedOn w:val="132"/>
     <w:link w:val="24"/>
+    <w:qFormat/>
     <w:uiPriority w:val="99"/>
   </w:style>
   <w:style w:type="paragraph" w:styleId="137">
@@ -14008,6 +14155,7 @@
     <w:name w:val="Heading 1 Char"/>
     <w:basedOn w:val="132"/>
     <w:link w:val="3"/>
+    <w:qFormat/>
     <w:uiPriority w:val="9"/>
     <w:rPr>
       <w:rFonts w:asciiTheme="majorHAnsi" w:hAnsiTheme="majorHAnsi" w:eastAsiaTheme="majorEastAsia" w:cstheme="majorBidi"/>
@@ -14022,6 +14170,7 @@
     <w:name w:val="Heading 2 Char"/>
     <w:basedOn w:val="132"/>
     <w:link w:val="4"/>
+    <w:qFormat/>
     <w:uiPriority w:val="9"/>
     <w:rPr>
       <w:rFonts w:asciiTheme="majorHAnsi" w:hAnsiTheme="majorHAnsi" w:eastAsiaTheme="majorEastAsia" w:cstheme="majorBidi"/>
@@ -14059,6 +14208,7 @@
     <w:name w:val="Title Char"/>
     <w:basedOn w:val="132"/>
     <w:link w:val="31"/>
+    <w:qFormat/>
     <w:uiPriority w:val="10"/>
     <w:rPr>
       <w:rFonts w:asciiTheme="majorHAnsi" w:hAnsiTheme="majorHAnsi" w:eastAsiaTheme="majorEastAsia" w:cstheme="majorBidi"/>
@@ -14118,6 +14268,7 @@
     <w:name w:val="Body Text 3 Char"/>
     <w:basedOn w:val="132"/>
     <w:link w:val="17"/>
+    <w:qFormat/>
     <w:uiPriority w:val="99"/>
     <w:rPr>
       <w:sz w:val="16"/>
@@ -14128,6 +14279,7 @@
     <w:name w:val="Macro Text Char"/>
     <w:basedOn w:val="132"/>
     <w:link w:val="2"/>
+    <w:qFormat/>
     <w:uiPriority w:val="99"/>
     <w:rPr>
       <w:rFonts w:ascii="Courier" w:hAnsi="Courier"/>
@@ -14157,6 +14309,7 @@
     <w:name w:val="Quote Char"/>
     <w:basedOn w:val="132"/>
     <w:link w:val="148"/>
+    <w:qFormat/>
     <w:uiPriority w:val="29"/>
     <w:rPr>
       <w:i/>
@@ -14194,6 +14347,7 @@
     <w:basedOn w:val="132"/>
     <w:link w:val="7"/>
     <w:semiHidden/>
+    <w:qFormat/>
     <w:uiPriority w:val="9"/>
     <w:rPr>
       <w:rFonts w:asciiTheme="majorHAnsi" w:hAnsiTheme="majorHAnsi" w:eastAsiaTheme="majorEastAsia" w:cstheme="majorBidi"/>
@@ -14205,6 +14359,7 @@
     <w:basedOn w:val="132"/>
     <w:link w:val="8"/>
     <w:semiHidden/>
+    <w:qFormat/>
     <w:uiPriority w:val="9"/>
     <w:rPr>
       <w:rFonts w:asciiTheme="majorHAnsi" w:hAnsiTheme="majorHAnsi" w:eastAsiaTheme="majorEastAsia" w:cstheme="majorBidi"/>
@@ -14239,6 +14394,7 @@
     <w:basedOn w:val="132"/>
     <w:link w:val="10"/>
     <w:semiHidden/>
+    <w:qFormat/>
     <w:uiPriority w:val="9"/>
     <w:rPr>
       <w:rFonts w:asciiTheme="majorHAnsi" w:hAnsiTheme="majorHAnsi" w:eastAsiaTheme="majorEastAsia" w:cstheme="majorBidi"/>
@@ -14257,6 +14413,7 @@
     <w:basedOn w:val="132"/>
     <w:link w:val="11"/>
     <w:semiHidden/>
+    <w:qFormat/>
     <w:uiPriority w:val="9"/>
     <w:rPr>
       <w:rFonts w:asciiTheme="majorHAnsi" w:hAnsiTheme="majorHAnsi" w:eastAsiaTheme="majorEastAsia" w:cstheme="majorBidi"/>
@@ -14306,6 +14463,7 @@
     <w:name w:val="Intense Quote Char"/>
     <w:basedOn w:val="132"/>
     <w:link w:val="156"/>
+    <w:qFormat/>
     <w:uiPriority w:val="30"/>
     <w:rPr>
       <w:b/>

</xml_diff>